<commit_message>
Sync the participant guide with today's dry-run fixes
The guide had drifted behind the notebook. Brings across all four changes
found walking the lab in a real HoL account: step 0 now creates a git-backed
workspace from this repository and warns about the personal compute dialog,
the CoWork instruction no longer tells attendees to click a button the
bootstrap now handles, and step 5 gains an Observability walkthrough that
proves the code execution step actually ran Python.
</commit_message>
<xml_diff>
--- a/guide/AZ_HoL_Participant_Guide.docx
+++ b/guide/AZ_HoL_Participant_Guide.docx
@@ -354,19 +354,104 @@
         <w:rPr>
           <w:b w:val="0"/>
         </w:rPr>
+        <w:t xml:space="preserve">Use the </w:t>
+      </w:r>
+      <w:r>
+        <w:rPr>
+          <w:b/>
+        </w:rPr>
+        <w:t>+</w:t>
+      </w:r>
+      <w:r>
+        <w:rPr>
+          <w:b w:val="0"/>
+        </w:rPr>
+        <w:t xml:space="preserve"> menu and choose </w:t>
+      </w:r>
+      <w:r>
+        <w:rPr>
+          <w:b/>
+        </w:rPr>
+        <w:t>From Git repository</w:t>
+      </w:r>
+      <w:r>
+        <w:rPr>
+          <w:b w:val="0"/>
+        </w:rPr>
+        <w:t xml:space="preserve">. Enter the repository URL </w:t>
+      </w:r>
+      <w:r>
+        <w:rPr>
+          <w:b/>
+        </w:rPr>
+        <w:t>https://github.com/Alexander122776/AZ-HOL-2026-Q3.git</w:t>
+      </w:r>
+      <w:r>
+        <w:rPr>
+          <w:b w:val="0"/>
+        </w:rPr>
+        <w:t xml:space="preserve">, name the workspace </w:t>
+      </w:r>
+      <w:r>
+        <w:rPr>
+          <w:b/>
+        </w:rPr>
+        <w:t>AZ-HOL-2026-Q3</w:t>
+      </w:r>
+      <w:r>
+        <w:rPr>
+          <w:b w:val="0"/>
+        </w:rPr>
+        <w:t xml:space="preserve">, choose the API integration </w:t>
+      </w:r>
+      <w:r>
+        <w:rPr>
+          <w:b/>
+        </w:rPr>
+        <w:t>AZ_HOL_ASSETS_API</w:t>
+      </w:r>
+      <w:r>
+        <w:rPr>
+          <w:b w:val="0"/>
+        </w:rPr>
+        <w:t xml:space="preserve">, and leave authentication empty because the repository is public. Click </w:t>
+      </w:r>
+      <w:r>
+        <w:rPr>
+          <w:b/>
+        </w:rPr>
+        <w:t>Create</w:t>
+      </w:r>
+      <w:r>
+        <w:rPr>
+          <w:b w:val="0"/>
+        </w:rPr>
+        <w:t>.</w:t>
+      </w:r>
+    </w:p>
+    <w:p>
+      <w:pPr>
+        <w:pStyle w:val="ListNumber"/>
+        <w:spacing w:after="60"/>
+        <w:ind w:left="403"/>
+      </w:pPr>
+      <w:r>
+        <w:rPr>
+          <w:b w:val="0"/>
+        </w:rPr>
         <w:t xml:space="preserve">Open the </w:t>
       </w:r>
       <w:r>
         <w:rPr>
           <w:b/>
         </w:rPr>
-        <w:t>AZ_FEASIBILITY_LAB</w:t>
+        <w:t>notebook</w:t>
       </w:r>
       <w:r>
         <w:rPr>
           <w:b w:val="0"/>
         </w:rPr>
-        <w:t xml:space="preserve"> workspace, then open </w:t>
+        <w:t xml:space="preserve"> folder, then open </w:t>
       </w:r>
       <w:r>
         <w:rPr>
@@ -379,6 +464,64 @@
           <w:b w:val="0"/>
         </w:rPr>
         <w:t>.</w:t>
+      </w:r>
+    </w:p>
+    <w:p>
+      <w:pPr>
+        <w:pStyle w:val="ListNumber"/>
+        <w:spacing w:after="60"/>
+        <w:ind w:left="403"/>
+      </w:pPr>
+      <w:r>
+        <w:rPr>
+          <w:b w:val="0"/>
+        </w:rPr>
+        <w:t xml:space="preserve">The first time you run a cell, a </w:t>
+      </w:r>
+      <w:r>
+        <w:rPr>
+          <w:b/>
+        </w:rPr>
+        <w:t>Connect your notebook</w:t>
+      </w:r>
+      <w:r>
+        <w:rPr>
+          <w:b w:val="0"/>
+        </w:rPr>
+        <w:t xml:space="preserve"> dialog appears asking you to configure personal compute. </w:t>
+      </w:r>
+      <w:r>
+        <w:rPr>
+          <w:b/>
+        </w:rPr>
+        <w:t>Accept every default</w:t>
+      </w:r>
+      <w:r>
+        <w:rPr>
+          <w:b w:val="0"/>
+        </w:rPr>
+        <w:t xml:space="preserve"> and click </w:t>
+      </w:r>
+      <w:r>
+        <w:rPr>
+          <w:b/>
+        </w:rPr>
+        <w:t>Create and connect</w:t>
+      </w:r>
+      <w:r>
+        <w:rPr>
+          <w:b w:val="0"/>
+        </w:rPr>
+        <w:t>. You do not need to change the service name or the artifact repository. It takes a minute or so to start, and only happens once.</w:t>
+      </w:r>
+    </w:p>
+    <w:p>
+      <w:r>
+        <w:rPr>
+          <w:b w:val="0"/>
+          <w:i w:val="0"/>
+        </w:rPr>
+        <w:t>This is the one thing you build yourself, and it takes about a minute. A git-backed workspace can only be created from that screen, so provisioning cannot do it for you. It also means the notebook you are about to run is visibly the one in the public repository rather than something that appeared in your account unexplained.</w:t>
       </w:r>
     </w:p>
     <w:p>
@@ -3422,14 +3565,14 @@
           <w:b/>
           <w:i w:val="0"/>
         </w:rPr>
-        <w:t>Then have them click + Add to Snowflake CoWork in the header of that page.</w:t>
+        <w:t>Both agents are already registered with the account's CoWork object</w:t>
       </w:r>
       <w:r>
         <w:rPr>
           <w:b w:val="0"/>
           <w:i w:val="0"/>
         </w:rPr>
-        <w:t xml:space="preserve"> Until that click the agent does not appear in the CoWork picker, and an attendee who skips it will think the deployment is broken. This is the single most likely place to lose the room in step 5.</w:t>
+        <w:t>, done at provisioning, so the agent appears in the CoWork picker with nothing to click. Worth mentioning to the room as a design point rather than skipping silently: an account that has a CoWork object hides any agent not explicitly added to it, and adding one needs MODIFY on that object. In the first dry run the attendee hit "You do not have MODIFY privilege to add agents to Snowflake CoWork" and the agent looked broken when it was merely unlisted. If an attendee builds their own agent later they will meet this, so it is worth thirty seconds.</w:t>
       </w:r>
     </w:p>
     <w:p>
@@ -3816,6 +3959,151 @@
           <w:i w:val="0"/>
         </w:rPr>
         <w:t>. You are looking at the tool choice being made, and at the actual query or code that produced the number.</w:t>
+      </w:r>
+    </w:p>
+    <w:p>
+      <w:pPr>
+        <w:spacing w:before="280" w:after="100"/>
+      </w:pPr>
+      <w:r>
+        <w:rPr>
+          <w:b/>
+          <w:color w:val="11567F"/>
+          <w:sz w:val="26"/>
+        </w:rPr>
+        <w:t>PROMPT: prove the Python ran, in Observability</w:t>
+      </w:r>
+    </w:p>
+    <w:p>
+      <w:r>
+        <w:rPr>
+          <w:b w:val="0"/>
+          <w:i w:val="0"/>
+        </w:rPr>
+        <w:t>Do not skip this. The reasoning block shows what the agent says it did; Observability shows what it did. For a room that will be asked to trust these answers, that distinction is the most valuable two minutes in step 5.</w:t>
+      </w:r>
+    </w:p>
+    <w:p>
+      <w:pPr>
+        <w:pStyle w:val="ListNumber"/>
+        <w:spacing w:after="60"/>
+        <w:ind w:left="403"/>
+      </w:pPr>
+      <w:r>
+        <w:rPr>
+          <w:b w:val="0"/>
+        </w:rPr>
+        <w:t xml:space="preserve">Go to </w:t>
+      </w:r>
+      <w:r>
+        <w:rPr>
+          <w:b/>
+        </w:rPr>
+        <w:t>AI &amp; ML &gt; Agents</w:t>
+      </w:r>
+      <w:r>
+        <w:rPr>
+          <w:b w:val="0"/>
+        </w:rPr>
+        <w:t xml:space="preserve">, open </w:t>
+      </w:r>
+      <w:r>
+        <w:rPr>
+          <w:b/>
+        </w:rPr>
+        <w:t>SITE_FEASIBILITY_AGENT</w:t>
+      </w:r>
+      <w:r>
+        <w:rPr>
+          <w:b w:val="0"/>
+        </w:rPr>
+        <w:t xml:space="preserve">, and choose the </w:t>
+      </w:r>
+      <w:r>
+        <w:rPr>
+          <w:b/>
+        </w:rPr>
+        <w:t>Observability</w:t>
+      </w:r>
+      <w:r>
+        <w:rPr>
+          <w:b w:val="0"/>
+        </w:rPr>
+        <w:t xml:space="preserve"> tab.</w:t>
+      </w:r>
+    </w:p>
+    <w:p>
+      <w:pPr>
+        <w:pStyle w:val="ListNumber"/>
+        <w:spacing w:after="60"/>
+        <w:ind w:left="403"/>
+      </w:pPr>
+      <w:r>
+        <w:rPr>
+          <w:b w:val="0"/>
+        </w:rPr>
+        <w:t>Sessions are listed by thread, labelled with the first question asked. Open the thread containing the plot question.</w:t>
+      </w:r>
+    </w:p>
+    <w:p>
+      <w:pPr>
+        <w:pStyle w:val="ListNumber"/>
+        <w:spacing w:after="60"/>
+        <w:ind w:left="403"/>
+      </w:pPr>
+      <w:r>
+        <w:rPr>
+          <w:b w:val="0"/>
+        </w:rPr>
+        <w:t>Read the trace top to bottom.</w:t>
+      </w:r>
+    </w:p>
+    <w:p>
+      <w:r>
+        <w:rPr>
+          <w:b w:val="0"/>
+          <w:i w:val="0"/>
+        </w:rPr>
+        <w:t xml:space="preserve">A real trace from the dry run, for the plot question: LLM Planning 5.5s, SQL Execution 608ms, LLM Planning 6.7s, </w:t>
+      </w:r>
+      <w:r>
+        <w:rPr>
+          <w:b/>
+          <w:i w:val="0"/>
+        </w:rPr>
+        <w:t>Code Execution: bash 7.4s</w:t>
+      </w:r>
+      <w:r>
+        <w:rPr>
+          <w:b w:val="0"/>
+          <w:i w:val="0"/>
+        </w:rPr>
+        <w:t>, LLM Planning 1.8s, Skill: chart_instructions 1ms, LLM Planning 2.5s, Code Execution: read 7ms, LLM Planning 9.5s, Chart Generation 2.2s, LLM Response Generation 14.7s. Total 56.1s.</w:t>
+      </w:r>
+    </w:p>
+    <w:p>
+      <w:r>
+        <w:rPr>
+          <w:b/>
+          <w:i w:val="0"/>
+        </w:rPr>
+        <w:t>Two points to draw out of it.</w:t>
+      </w:r>
+      <w:r>
+        <w:rPr>
+          <w:b w:val="0"/>
+          <w:i w:val="0"/>
+        </w:rPr>
+        <w:t xml:space="preserve"> First, Code Execution is a separate step from SQL Execution - the rows were fetched, then handed to Python. The agent did not compute medians in SQL and narrate a chart, it wrote and ran code, and this is where you can prove it. Second, planning dominates the clock: the LLM steps total roughly 40 of those 56 seconds against 608ms of SQL. That is the honest answer to why agents feel slow, and it is exactly why step 6's app calls the fast agent with a tighter budget and no sandbox.</w:t>
+      </w:r>
+    </w:p>
+    <w:p>
+      <w:r>
+        <w:rPr>
+          <w:b w:val="0"/>
+          <w:i w:val="0"/>
+        </w:rPr>
+        <w:t>If anyone asks whether the model fabricated the chart, this tab settles it either way. That is a better answer than reassurance.</w:t>
       </w:r>
     </w:p>
     <w:tbl>

</xml_diff>